<commit_message>
Versao final do curso
</commit_message>
<xml_diff>
--- a/aula5/aula5_4_playbook_phishing_adaptado.docx
+++ b/aula5/aula5_4_playbook_phishing_adaptado.docx
@@ -4,15 +4,11 @@
   <w:body>
     <w:p>
       <w:pPr>
+        <w:pStyle w:val="Title"/>
         <w:jc w:val="center"/>
       </w:pPr>
       <w:r>
-        <w:rPr>
-          <w:b/>
-          <w:color w:val="1A3A5C"/>
-          <w:sz w:val="36"/>
-        </w:rPr>
-        <w:t>PLAYBOOK PB-001 - ADAPTADO TECHVAREJO S.A.</w:t>
+        <w:t>PLAYBOOK PB-001</w:t>
       </w:r>
     </w:p>
     <w:p>
@@ -22,9 +18,10 @@
       <w:r>
         <w:rPr>
           <w:b/>
-          <w:color w:val="1A3A5C"/>
-          <w:sz w:val="28"/>
+          <w:sz w:val="32"/>
         </w:rPr>
+        <w:t>ADAPTADO TECHVAREJO S.A.</w:t>
+        <w:br/>
         <w:t>RESPOSTA A INCIDENTES DE PHISHING</w:t>
       </w:r>
     </w:p>
@@ -34,359 +31,389 @@
       </w:pPr>
       <w:r>
         <w:rPr>
-          <w:color w:val="666666"/>
-          <w:sz w:val="20"/>
+          <w:i/>
+          <w:sz w:val="24"/>
         </w:rPr>
-        <w:t>Versao 3.0 - 01/06/2026</w:t>
+        <w:t>Versão 3.0 - 01/06/2026</w:t>
       </w:r>
     </w:p>
     <w:p/>
     <w:p>
       <w:pPr>
-        <w:pStyle w:val="Heading2"/>
+        <w:pStyle w:val="Heading1"/>
       </w:pPr>
       <w:r>
-        <w:rPr>
-          <w:color w:val="1A3A5C"/>
-        </w:rPr>
         <w:t>1. METADADOS</w:t>
       </w:r>
     </w:p>
-    <w:p>
-      <w:pPr>
-        <w:spacing w:after="40"/>
-      </w:pPr>
-      <w:r>
-        <w:rPr>
-          <w:b/>
-        </w:rPr>
-        <w:t xml:space="preserve">ID: </w:t>
-      </w:r>
-      <w:r>
-        <w:t>PB-001</w:t>
-      </w:r>
-    </w:p>
-    <w:p>
-      <w:pPr>
-        <w:spacing w:after="40"/>
-      </w:pPr>
-      <w:r>
-        <w:rPr>
-          <w:b/>
-        </w:rPr>
-        <w:t xml:space="preserve">Nome: </w:t>
-      </w:r>
-      <w:r>
-        <w:t>Resposta a Incidentes de Phishing</w:t>
-      </w:r>
-    </w:p>
-    <w:p>
-      <w:pPr>
-        <w:spacing w:after="40"/>
-      </w:pPr>
-      <w:r>
-        <w:rPr>
-          <w:b/>
-        </w:rPr>
-        <w:t xml:space="preserve">Versao: </w:t>
-      </w:r>
-      <w:r>
-        <w:t>3.0 (adaptada para TechVarejo S.A.)</w:t>
-      </w:r>
-    </w:p>
-    <w:p>
-      <w:pPr>
-        <w:spacing w:after="40"/>
-      </w:pPr>
-      <w:r>
-        <w:rPr>
-          <w:b/>
-        </w:rPr>
-        <w:t xml:space="preserve">Data: </w:t>
-      </w:r>
-      <w:r>
-        <w:t>01/06/2026</w:t>
-      </w:r>
-    </w:p>
-    <w:p>
-      <w:pPr>
-        <w:spacing w:after="40"/>
-      </w:pPr>
-      <w:r>
-        <w:rPr>
-          <w:b/>
-        </w:rPr>
-        <w:t xml:space="preserve">Dono: </w:t>
-      </w:r>
-      <w:r>
-        <w:t>Lider do SOC (Juliana Costa - juliana.costa@techvarejo.com.br)</w:t>
-      </w:r>
-    </w:p>
-    <w:p>
-      <w:pPr>
-        <w:spacing w:after="40"/>
-      </w:pPr>
-      <w:r>
-        <w:rPr>
-          <w:b/>
-        </w:rPr>
-        <w:t xml:space="preserve">Severidade padrao: </w:t>
-      </w:r>
-      <w:r>
-        <w:t>P2</w:t>
-      </w:r>
-    </w:p>
+    <w:tbl>
+      <w:tblPr>
+        <w:tblStyle w:val="TableGrid"/>
+        <w:tblW w:type="auto" w:w="0"/>
+        <w:tblLook w:firstColumn="1" w:firstRow="1" w:lastColumn="0" w:lastRow="0" w:noHBand="0" w:noVBand="1" w:val="04A0"/>
+      </w:tblPr>
+      <w:tblGrid>
+        <w:gridCol w:w="4320"/>
+        <w:gridCol w:w="4320"/>
+      </w:tblGrid>
+      <w:tr>
+        <w:tc>
+          <w:tcPr>
+            <w:tcW w:type="dxa" w:w="4320"/>
+            <w:shd w:val="clear" w:color="auto" w:fill="D9E2F3"/>
+          </w:tcPr>
+          <w:p>
+            <w:r>
+              <w:rPr>
+                <w:b/>
+              </w:rPr>
+              <w:t>ID</w:t>
+            </w:r>
+          </w:p>
+        </w:tc>
+        <w:tc>
+          <w:tcPr>
+            <w:tcW w:type="dxa" w:w="4320"/>
+          </w:tcPr>
+          <w:p>
+            <w:r>
+              <w:t>PB-001</w:t>
+            </w:r>
+          </w:p>
+        </w:tc>
+      </w:tr>
+      <w:tr>
+        <w:tc>
+          <w:tcPr>
+            <w:tcW w:type="dxa" w:w="4320"/>
+            <w:shd w:val="clear" w:color="auto" w:fill="D9E2F3"/>
+          </w:tcPr>
+          <w:p>
+            <w:r>
+              <w:rPr>
+                <w:b/>
+              </w:rPr>
+              <w:t>Nome</w:t>
+            </w:r>
+          </w:p>
+        </w:tc>
+        <w:tc>
+          <w:tcPr>
+            <w:tcW w:type="dxa" w:w="4320"/>
+          </w:tcPr>
+          <w:p>
+            <w:r>
+              <w:t>Resposta a Incidentes de Phishing</w:t>
+            </w:r>
+          </w:p>
+        </w:tc>
+      </w:tr>
+      <w:tr>
+        <w:tc>
+          <w:tcPr>
+            <w:tcW w:type="dxa" w:w="4320"/>
+            <w:shd w:val="clear" w:color="auto" w:fill="D9E2F3"/>
+          </w:tcPr>
+          <w:p>
+            <w:r>
+              <w:rPr>
+                <w:b/>
+              </w:rPr>
+              <w:t>Versão</w:t>
+            </w:r>
+          </w:p>
+        </w:tc>
+        <w:tc>
+          <w:tcPr>
+            <w:tcW w:type="dxa" w:w="4320"/>
+          </w:tcPr>
+          <w:p>
+            <w:r>
+              <w:t>3.0 (adaptada para TechVarejo S.A.)</w:t>
+            </w:r>
+          </w:p>
+        </w:tc>
+      </w:tr>
+      <w:tr>
+        <w:tc>
+          <w:tcPr>
+            <w:tcW w:type="dxa" w:w="4320"/>
+            <w:shd w:val="clear" w:color="auto" w:fill="D9E2F3"/>
+          </w:tcPr>
+          <w:p>
+            <w:r>
+              <w:rPr>
+                <w:b/>
+              </w:rPr>
+              <w:t>Data da última revisão</w:t>
+            </w:r>
+          </w:p>
+        </w:tc>
+        <w:tc>
+          <w:tcPr>
+            <w:tcW w:type="dxa" w:w="4320"/>
+          </w:tcPr>
+          <w:p>
+            <w:r>
+              <w:t>01/06/2026</w:t>
+            </w:r>
+          </w:p>
+        </w:tc>
+      </w:tr>
+      <w:tr>
+        <w:tc>
+          <w:tcPr>
+            <w:tcW w:type="dxa" w:w="4320"/>
+            <w:shd w:val="clear" w:color="auto" w:fill="D9E2F3"/>
+          </w:tcPr>
+          <w:p>
+            <w:r>
+              <w:rPr>
+                <w:b/>
+              </w:rPr>
+              <w:t>Dono</w:t>
+            </w:r>
+          </w:p>
+        </w:tc>
+        <w:tc>
+          <w:tcPr>
+            <w:tcW w:type="dxa" w:w="4320"/>
+          </w:tcPr>
+          <w:p>
+            <w:r>
+              <w:t>Líder do SOC (Juliana Costa - juliana.costa@techvarejo.com.br)</w:t>
+            </w:r>
+          </w:p>
+        </w:tc>
+      </w:tr>
+      <w:tr>
+        <w:tc>
+          <w:tcPr>
+            <w:tcW w:type="dxa" w:w="4320"/>
+            <w:shd w:val="clear" w:color="auto" w:fill="D9E2F3"/>
+          </w:tcPr>
+          <w:p>
+            <w:r>
+              <w:rPr>
+                <w:b/>
+              </w:rPr>
+              <w:t>Severidade padrão</w:t>
+            </w:r>
+          </w:p>
+        </w:tc>
+        <w:tc>
+          <w:tcPr>
+            <w:tcW w:type="dxa" w:w="4320"/>
+          </w:tcPr>
+          <w:p>
+            <w:r>
+              <w:t>P2</w:t>
+            </w:r>
+          </w:p>
+        </w:tc>
+      </w:tr>
+      <w:tr>
+        <w:tc>
+          <w:tcPr>
+            <w:tcW w:type="dxa" w:w="4320"/>
+            <w:shd w:val="clear" w:color="auto" w:fill="D9E2F3"/>
+          </w:tcPr>
+          <w:p>
+            <w:r>
+              <w:rPr>
+                <w:b/>
+              </w:rPr>
+              <w:t>Cenário</w:t>
+            </w:r>
+          </w:p>
+        </w:tc>
+        <w:tc>
+          <w:tcPr>
+            <w:tcW w:type="dxa" w:w="4320"/>
+          </w:tcPr>
+          <w:p>
+            <w:r>
+              <w:t>Usuário reporta ou SIEM detecta e-mail malicioso</w:t>
+            </w:r>
+          </w:p>
+        </w:tc>
+      </w:tr>
+    </w:tbl>
     <w:p/>
     <w:p>
       <w:pPr>
-        <w:pStyle w:val="Heading2"/>
+        <w:pStyle w:val="Heading1"/>
       </w:pPr>
       <w:r>
-        <w:rPr>
-          <w:color w:val="1A3A5C"/>
-        </w:rPr>
         <w:t>2. GATILHOS</w:t>
       </w:r>
     </w:p>
     <w:p>
       <w:pPr>
         <w:pStyle w:val="ListBullet"/>
-        <w:spacing w:after="60"/>
       </w:pPr>
       <w:r>
-        <w:rPr>
-          <w:sz w:val="22"/>
-        </w:rPr>
-        <w:t>[ ] Alerta Splunk - Regra: 'Phishing Reported - Multiple Recipients' (https://splunk.techvarejo.com.br)</w:t>
+        <w:t>[ ] Alerta Splunk - Regra: "Phishing Reported - Multiple Recipients"</w:t>
       </w:r>
     </w:p>
     <w:p>
       <w:pPr>
         <w:pStyle w:val="ListBullet"/>
-        <w:spacing w:after="60"/>
       </w:pPr>
       <w:r>
-        <w:rPr>
-          <w:sz w:val="22"/>
-        </w:rPr>
-        <w:t>[ ] Chamado de usuario via GLPI (https://sd.techvarejo.com.br)</w:t>
+        <w:t>[ ] URL Splunk: https://splunk.techvarejo.com.br</w:t>
       </w:r>
     </w:p>
     <w:p>
       <w:pPr>
         <w:pStyle w:val="ListBullet"/>
-        <w:spacing w:after="60"/>
       </w:pPr>
       <w:r>
-        <w:rPr>
-          <w:sz w:val="22"/>
-        </w:rPr>
-        <w:t>[ ] Notificacao externa (parceiro, cliente)</w:t>
+        <w:t>[ ] Chamado de usuário via Service Desk (GLPI - https://sd.techvarejo.com.br)</w:t>
       </w:r>
     </w:p>
     <w:p>
       <w:pPr>
         <w:pStyle w:val="ListBullet"/>
-        <w:spacing w:after="60"/>
       </w:pPr>
       <w:r>
-        <w:rPr>
-          <w:sz w:val="22"/>
-        </w:rPr>
+        <w:t>[ ] Notificação externa (parceiro, cliente)</w:t>
+      </w:r>
+    </w:p>
+    <w:p>
+      <w:pPr>
+        <w:pStyle w:val="ListBullet"/>
+      </w:pPr>
+      <w:r>
         <w:t>[ ] Descoberta proativa pelo SOC</w:t>
       </w:r>
     </w:p>
     <w:p/>
     <w:p>
       <w:pPr>
-        <w:pStyle w:val="Heading2"/>
+        <w:pStyle w:val="Heading1"/>
       </w:pPr>
       <w:r>
-        <w:rPr>
-          <w:color w:val="1A3A5C"/>
-        </w:rPr>
-        <w:t>3. PRE-REQUISITOS</w:t>
+        <w:t>3. PRÉ-REQUISITOS</w:t>
       </w:r>
     </w:p>
     <w:p>
       <w:pPr>
-        <w:spacing w:after="120"/>
+        <w:pStyle w:val="Heading2"/>
       </w:pPr>
       <w:r>
-        <w:rPr>
-          <w:b/>
-          <w:sz w:val="22"/>
-        </w:rPr>
-        <w:t>Ferramentas necessarias (com URLs):</w:t>
+        <w:t>Ferramentas necessárias (com URLs):</w:t>
       </w:r>
     </w:p>
     <w:p>
       <w:pPr>
         <w:pStyle w:val="ListBullet"/>
-        <w:spacing w:after="60"/>
       </w:pPr>
       <w:r>
-        <w:rPr>
-          <w:sz w:val="22"/>
-        </w:rPr>
         <w:t>Splunk Enterprise: https://splunk.techvarejo.com.br</w:t>
       </w:r>
     </w:p>
     <w:p>
       <w:pPr>
         <w:pStyle w:val="ListBullet"/>
-        <w:spacing w:after="60"/>
       </w:pPr>
       <w:r>
-        <w:rPr>
-          <w:sz w:val="22"/>
-        </w:rPr>
         <w:t>Microsoft 365 Admin Center: https://admin.microsoft.com</w:t>
       </w:r>
     </w:p>
     <w:p>
       <w:pPr>
         <w:pStyle w:val="ListBullet"/>
-        <w:spacing w:after="60"/>
       </w:pPr>
       <w:r>
-        <w:rPr>
-          <w:sz w:val="22"/>
-        </w:rPr>
         <w:t>MxToolbox: https://mxtoolbox.com/EmailHeaders.aspx</w:t>
       </w:r>
     </w:p>
     <w:p>
       <w:pPr>
         <w:pStyle w:val="ListBullet"/>
-        <w:spacing w:after="60"/>
       </w:pPr>
       <w:r>
-        <w:rPr>
-          <w:sz w:val="22"/>
-        </w:rPr>
         <w:t>VirusTotal Enterprise: https://vt.techvarejo.com.br</w:t>
       </w:r>
     </w:p>
     <w:p>
       <w:pPr>
         <w:pStyle w:val="ListBullet"/>
-        <w:spacing w:after="60"/>
       </w:pPr>
       <w:r>
-        <w:rPr>
-          <w:sz w:val="22"/>
-        </w:rPr>
-        <w:t>Mimecast: https://mimecast.techvarejo.com.br</w:t>
+        <w:t>Mimecast (firewall de e-mail): https://mimecast.techvarejo.com.br</w:t>
       </w:r>
     </w:p>
     <w:p>
       <w:pPr>
         <w:pStyle w:val="ListBullet"/>
-        <w:spacing w:after="60"/>
       </w:pPr>
       <w:r>
-        <w:rPr>
-          <w:sz w:val="22"/>
-        </w:rPr>
-        <w:t>Zscaler: https://zscaler.techvarejo.com.br</w:t>
+        <w:t>Zscaler (proxy): https://zscaler.techvarejo.com.br</w:t>
       </w:r>
     </w:p>
-    <w:p/>
     <w:p>
       <w:pPr>
-        <w:spacing w:after="120"/>
+        <w:pStyle w:val="Heading2"/>
       </w:pPr>
       <w:r>
-        <w:rPr>
-          <w:b/>
-          <w:sz w:val="22"/>
-        </w:rPr>
         <w:t>Runbooks referenciados (TechVarejo):</w:t>
       </w:r>
     </w:p>
     <w:p>
       <w:pPr>
         <w:pStyle w:val="ListBullet"/>
-        <w:spacing w:after="60"/>
       </w:pPr>
       <w:r>
-        <w:rPr>
-          <w:sz w:val="22"/>
-        </w:rPr>
         <w:t>PROC-SEC-003: Isolamento de Caixa Postal no Office 365</w:t>
       </w:r>
     </w:p>
     <w:p>
       <w:pPr>
         <w:pStyle w:val="ListBullet"/>
-        <w:spacing w:after="60"/>
       </w:pPr>
       <w:r>
-        <w:rPr>
-          <w:sz w:val="22"/>
-        </w:rPr>
         <w:t>PROC-SEC-004: Reset de Senha no Active Directory</w:t>
       </w:r>
     </w:p>
     <w:p>
       <w:pPr>
         <w:pStyle w:val="ListBullet"/>
-        <w:spacing w:after="60"/>
       </w:pPr>
       <w:r>
-        <w:rPr>
-          <w:sz w:val="22"/>
-        </w:rPr>
-        <w:t>PROC-SEC-007: Revogacao de Tokens no Azure AD</w:t>
+        <w:t>PROC-SEC-007: Revogação de Tokens no Azure AD</w:t>
       </w:r>
     </w:p>
     <w:p>
       <w:pPr>
         <w:pStyle w:val="ListBullet"/>
-        <w:spacing w:after="60"/>
       </w:pPr>
       <w:r>
-        <w:rPr>
-          <w:sz w:val="22"/>
-        </w:rPr>
         <w:t>PROC-SEC-009: Bloqueio de Remetente no Mimecast</w:t>
       </w:r>
     </w:p>
     <w:p>
       <w:pPr>
         <w:pStyle w:val="ListBullet"/>
-        <w:spacing w:after="60"/>
       </w:pPr>
       <w:r>
-        <w:rPr>
-          <w:sz w:val="22"/>
-        </w:rPr>
-        <w:t>PROC-SEC-012: Analise de Cabecalho de E-mail</w:t>
+        <w:t>PROC-SEC-012: Análise de Cabeçalho de E-mail</w:t>
       </w:r>
     </w:p>
     <w:p>
       <w:pPr>
         <w:pStyle w:val="ListBullet"/>
-        <w:spacing w:after="60"/>
       </w:pPr>
       <w:r>
-        <w:rPr>
-          <w:sz w:val="22"/>
-        </w:rPr>
         <w:t>PROC-SEC-015: Bloqueio de URL no Zscaler</w:t>
       </w:r>
     </w:p>
-    <w:p/>
     <w:p>
       <w:pPr>
-        <w:spacing w:after="120"/>
+        <w:pStyle w:val="Heading2"/>
       </w:pPr>
       <w:r>
-        <w:rPr>
-          <w:b/>
-          <w:sz w:val="22"/>
-        </w:rPr>
         <w:t>Contatos (TechVarejo):</w:t>
       </w:r>
     </w:p>
@@ -398,19 +425,21 @@
         <w:tblLook w:firstColumn="1" w:firstRow="1" w:lastColumn="0" w:lastRow="0" w:noHBand="0" w:noVBand="1" w:val="04A0"/>
       </w:tblPr>
       <w:tblGrid>
-        <w:gridCol w:w="3135"/>
-        <w:gridCol w:w="3135"/>
-        <w:gridCol w:w="3135"/>
+        <w:gridCol w:w="2880"/>
+        <w:gridCol w:w="2880"/>
+        <w:gridCol w:w="2880"/>
       </w:tblGrid>
       <w:tr>
         <w:tc>
           <w:tcPr>
-            <w:tcW w:type="dxa" w:w="3135"/>
+            <w:tcW w:type="dxa" w:w="2880"/>
+            <w:shd w:val="clear" w:color="auto" w:fill="1F4E79"/>
           </w:tcPr>
           <w:p>
             <w:r>
               <w:rPr>
                 <w:b/>
+                <w:color w:val="FFFFFF"/>
                 <w:sz w:val="20"/>
               </w:rPr>
               <w:t>Papel</w:t>
@@ -419,12 +448,14 @@
         </w:tc>
         <w:tc>
           <w:tcPr>
-            <w:tcW w:type="dxa" w:w="3135"/>
+            <w:tcW w:type="dxa" w:w="2880"/>
+            <w:shd w:val="clear" w:color="auto" w:fill="1F4E79"/>
           </w:tcPr>
           <w:p>
             <w:r>
               <w:rPr>
                 <w:b/>
+                <w:color w:val="FFFFFF"/>
                 <w:sz w:val="20"/>
               </w:rPr>
               <w:t>Titular</w:t>
@@ -433,12 +464,14 @@
         </w:tc>
         <w:tc>
           <w:tcPr>
-            <w:tcW w:type="dxa" w:w="3135"/>
+            <w:tcW w:type="dxa" w:w="2880"/>
+            <w:shd w:val="clear" w:color="auto" w:fill="1F4E79"/>
           </w:tcPr>
           <w:p>
             <w:r>
               <w:rPr>
                 <w:b/>
+                <w:color w:val="FFFFFF"/>
                 <w:sz w:val="20"/>
               </w:rPr>
               <w:t>Backup</w:t>
@@ -449,21 +482,29 @@
       <w:tr>
         <w:tc>
           <w:tcPr>
-            <w:tcW w:type="dxa" w:w="3135"/>
+            <w:tcW w:type="dxa" w:w="2880"/>
           </w:tcPr>
           <w:p>
             <w:r>
+              <w:rPr>
+                <w:sz w:val="20"/>
+              </w:rPr>
               <w:t>IC</w:t>
             </w:r>
           </w:p>
         </w:tc>
         <w:tc>
           <w:tcPr>
-            <w:tcW w:type="dxa" w:w="3135"/>
+            <w:tcW w:type="dxa" w:w="2880"/>
           </w:tcPr>
           <w:p>
             <w:r>
-              <w:t>Ricardo Mendes - (11) 95555-1001</w:t>
+              <w:rPr>
+                <w:sz w:val="20"/>
+              </w:rPr>
+              <w:t>Ricardo Mendes</w:t>
+              <w:br/>
+              <w:t>(11) 95555-1001</w:t>
               <w:br/>
               <w:t>ricardo@techvarejo.com.br</w:t>
             </w:r>
@@ -471,11 +512,18 @@
         </w:tc>
         <w:tc>
           <w:tcPr>
-            <w:tcW w:type="dxa" w:w="3135"/>
+            <w:tcW w:type="dxa" w:w="2880"/>
           </w:tcPr>
           <w:p>
             <w:r>
-              <w:t>Fernanda Lima - (11) 95555-1002</w:t>
+              <w:rPr>
+                <w:sz w:val="20"/>
+              </w:rPr>
+              <w:t>Fernanda Lima</w:t>
+              <w:br/>
+              <w:t>(11) 95555-1002</w:t>
+              <w:br/>
+              <w:t>fernanda@techvarejo.com.br</w:t>
             </w:r>
           </w:p>
         </w:tc>
@@ -483,21 +531,29 @@
       <w:tr>
         <w:tc>
           <w:tcPr>
-            <w:tcW w:type="dxa" w:w="3135"/>
+            <w:tcW w:type="dxa" w:w="2880"/>
           </w:tcPr>
           <w:p>
             <w:r>
-              <w:t>N2 (Plantao)</w:t>
+              <w:rPr>
+                <w:sz w:val="20"/>
+              </w:rPr>
+              <w:t>N2 (Plantão 24x7)</w:t>
             </w:r>
           </w:p>
         </w:tc>
         <w:tc>
           <w:tcPr>
-            <w:tcW w:type="dxa" w:w="3135"/>
+            <w:tcW w:type="dxa" w:w="2880"/>
           </w:tcPr>
           <w:p>
             <w:r>
-              <w:t>Juliana Costa - (11) 95555-2001</w:t>
+              <w:rPr>
+                <w:sz w:val="20"/>
+              </w:rPr>
+              <w:t>Juliana Costa</w:t>
+              <w:br/>
+              <w:t>(11) 95555-2001</w:t>
               <w:br/>
               <w:t>juliana@techvarejo.com.br</w:t>
             </w:r>
@@ -505,11 +561,18 @@
         </w:tc>
         <w:tc>
           <w:tcPr>
-            <w:tcW w:type="dxa" w:w="3135"/>
+            <w:tcW w:type="dxa" w:w="2880"/>
           </w:tcPr>
           <w:p>
             <w:r>
-              <w:t>Marcos Vinicius - (11) 95555-2002</w:t>
+              <w:rPr>
+                <w:sz w:val="20"/>
+              </w:rPr>
+              <w:t>Marcos Vinícius</w:t>
+              <w:br/>
+              <w:t>(11) 95555-2002</w:t>
+              <w:br/>
+              <w:t>marcos@techvarejo.com.br</w:t>
             </w:r>
           </w:p>
         </w:tc>
@@ -517,31 +580,44 @@
       <w:tr>
         <w:tc>
           <w:tcPr>
-            <w:tcW w:type="dxa" w:w="3135"/>
+            <w:tcW w:type="dxa" w:w="2880"/>
           </w:tcPr>
           <w:p>
             <w:r>
-              <w:t>Juridico</w:t>
+              <w:rPr>
+                <w:sz w:val="20"/>
+              </w:rPr>
+              <w:t>Jurídico</w:t>
             </w:r>
           </w:p>
         </w:tc>
         <w:tc>
           <w:tcPr>
-            <w:tcW w:type="dxa" w:w="3135"/>
+            <w:tcW w:type="dxa" w:w="2880"/>
           </w:tcPr>
           <w:p>
             <w:r>
-              <w:t>Dra. Fernanda Lima - (11) 95555-3001</w:t>
+              <w:rPr>
+                <w:sz w:val="20"/>
+              </w:rPr>
+              <w:t>Dra. Fernanda Lima</w:t>
+              <w:br/>
+              <w:t>(11) 95555-3001</w:t>
             </w:r>
           </w:p>
         </w:tc>
         <w:tc>
           <w:tcPr>
-            <w:tcW w:type="dxa" w:w="3135"/>
+            <w:tcW w:type="dxa" w:w="2880"/>
           </w:tcPr>
           <w:p>
             <w:r>
-              <w:t>Dr. Roberto Alves - (11) 95555-3002</w:t>
+              <w:rPr>
+                <w:sz w:val="20"/>
+              </w:rPr>
+              <w:t>Dr. Roberto Alves</w:t>
+              <w:br/>
+              <w:t>(11) 95555-3002</w:t>
             </w:r>
           </w:p>
         </w:tc>
@@ -549,30 +625,41 @@
       <w:tr>
         <w:tc>
           <w:tcPr>
-            <w:tcW w:type="dxa" w:w="3135"/>
+            <w:tcW w:type="dxa" w:w="2880"/>
           </w:tcPr>
           <w:p>
             <w:r>
+              <w:rPr>
+                <w:sz w:val="20"/>
+              </w:rPr>
               <w:t>DPO</w:t>
             </w:r>
           </w:p>
         </w:tc>
         <w:tc>
           <w:tcPr>
-            <w:tcW w:type="dxa" w:w="3135"/>
+            <w:tcW w:type="dxa" w:w="2880"/>
           </w:tcPr>
           <w:p>
             <w:r>
-              <w:t>Ana Oliveira - (11) 95555-4001</w:t>
+              <w:rPr>
+                <w:sz w:val="20"/>
+              </w:rPr>
+              <w:t>Ana Oliveira</w:t>
+              <w:br/>
+              <w:t>(11) 95555-4001</w:t>
             </w:r>
           </w:p>
         </w:tc>
         <w:tc>
           <w:tcPr>
-            <w:tcW w:type="dxa" w:w="3135"/>
+            <w:tcW w:type="dxa" w:w="2880"/>
           </w:tcPr>
           <w:p>
             <w:r>
+              <w:rPr>
+                <w:sz w:val="20"/>
+              </w:rPr>
               <w:t>-</w:t>
             </w:r>
           </w:p>
@@ -581,31 +668,346 @@
       <w:tr>
         <w:tc>
           <w:tcPr>
-            <w:tcW w:type="dxa" w:w="3135"/>
+            <w:tcW w:type="dxa" w:w="2880"/>
           </w:tcPr>
           <w:p>
             <w:r>
+              <w:rPr>
+                <w:sz w:val="20"/>
+              </w:rPr>
               <w:t>Redes</w:t>
             </w:r>
           </w:p>
         </w:tc>
         <w:tc>
           <w:tcPr>
-            <w:tcW w:type="dxa" w:w="3135"/>
+            <w:tcW w:type="dxa" w:w="2880"/>
           </w:tcPr>
           <w:p>
             <w:r>
-              <w:t>Roberto Almeida - (11) 95555-5001</w:t>
+              <w:rPr>
+                <w:sz w:val="20"/>
+              </w:rPr>
+              <w:t>Roberto Almeida</w:t>
+              <w:br/>
+              <w:t>(11) 95555-5001</w:t>
             </w:r>
           </w:p>
         </w:tc>
         <w:tc>
           <w:tcPr>
-            <w:tcW w:type="dxa" w:w="3135"/>
+            <w:tcW w:type="dxa" w:w="2880"/>
           </w:tcPr>
           <w:p>
             <w:r>
-              <w:t>Carlos Santos - (11) 95555-5002</w:t>
+              <w:rPr>
+                <w:sz w:val="20"/>
+              </w:rPr>
+              <w:t>Carlos Santos</w:t>
+              <w:br/>
+              <w:t>(11) 95555-5002</w:t>
+            </w:r>
+          </w:p>
+        </w:tc>
+      </w:tr>
+    </w:tbl>
+    <w:p/>
+    <w:p>
+      <w:pPr>
+        <w:pStyle w:val="Heading1"/>
+      </w:pPr>
+      <w:r>
+        <w:t>4. FLUXOGRAMA DE DECISÃO</w:t>
+      </w:r>
+    </w:p>
+    <w:p>
+      <w:r>
+        <w:rPr>
+          <w:i/>
+        </w:rPr>
+        <w:t>[DIAGRAMA - ver documento PDF original]</w:t>
+      </w:r>
+    </w:p>
+    <w:p/>
+    <w:p>
+      <w:pPr>
+        <w:pStyle w:val="Heading1"/>
+      </w:pPr>
+      <w:r>
+        <w:t>5. FASES DETALHADAS</w:t>
+      </w:r>
+    </w:p>
+    <w:p>
+      <w:pPr>
+        <w:pStyle w:val="Heading2"/>
+      </w:pPr>
+      <w:r>
+        <w:t>5.1 FASE 1 - DETECÇÃO E TRIAGEM</w:t>
+      </w:r>
+    </w:p>
+    <w:tbl>
+      <w:tblPr>
+        <w:tblStyle w:val="TableGrid"/>
+        <w:tblW w:type="auto" w:w="0"/>
+        <w:jc w:val="center"/>
+        <w:tblLook w:firstColumn="1" w:firstRow="1" w:lastColumn="0" w:lastRow="0" w:noHBand="0" w:noVBand="1" w:val="04A0"/>
+      </w:tblPr>
+      <w:tblGrid>
+        <w:gridCol w:w="2880"/>
+        <w:gridCol w:w="2880"/>
+        <w:gridCol w:w="2880"/>
+      </w:tblGrid>
+      <w:tr>
+        <w:tc>
+          <w:tcPr>
+            <w:tcW w:type="dxa" w:w="2880"/>
+            <w:shd w:val="clear" w:color="auto" w:fill="1F4E79"/>
+          </w:tcPr>
+          <w:p>
+            <w:r>
+              <w:rPr>
+                <w:b/>
+                <w:color w:val="FFFFFF"/>
+                <w:sz w:val="20"/>
+              </w:rPr>
+              <w:t>Passo</w:t>
+            </w:r>
+          </w:p>
+        </w:tc>
+        <w:tc>
+          <w:tcPr>
+            <w:tcW w:type="dxa" w:w="2880"/>
+            <w:shd w:val="clear" w:color="auto" w:fill="1F4E79"/>
+          </w:tcPr>
+          <w:p>
+            <w:r>
+              <w:rPr>
+                <w:b/>
+                <w:color w:val="FFFFFF"/>
+                <w:sz w:val="20"/>
+              </w:rPr>
+              <w:t>Ação</w:t>
+            </w:r>
+          </w:p>
+        </w:tc>
+        <w:tc>
+          <w:tcPr>
+            <w:tcW w:type="dxa" w:w="2880"/>
+            <w:shd w:val="clear" w:color="auto" w:fill="1F4E79"/>
+          </w:tcPr>
+          <w:p>
+            <w:r>
+              <w:rPr>
+                <w:b/>
+                <w:color w:val="FFFFFF"/>
+                <w:sz w:val="20"/>
+              </w:rPr>
+              <w:t>Ferramenta/Proced.</w:t>
+            </w:r>
+          </w:p>
+        </w:tc>
+      </w:tr>
+      <w:tr>
+        <w:tc>
+          <w:tcPr>
+            <w:tcW w:type="dxa" w:w="2880"/>
+          </w:tcPr>
+          <w:p>
+            <w:r>
+              <w:rPr>
+                <w:sz w:val="20"/>
+              </w:rPr>
+              <w:t>1.1</w:t>
+            </w:r>
+          </w:p>
+        </w:tc>
+        <w:tc>
+          <w:tcPr>
+            <w:tcW w:type="dxa" w:w="2880"/>
+          </w:tcPr>
+          <w:p>
+            <w:r>
+              <w:rPr>
+                <w:sz w:val="20"/>
+              </w:rPr>
+              <w:t>Registrar ticket no GLPI com: remetente, assunto, data/hora, usuário reportante</w:t>
+            </w:r>
+          </w:p>
+        </w:tc>
+        <w:tc>
+          <w:tcPr>
+            <w:tcW w:type="dxa" w:w="2880"/>
+          </w:tcPr>
+          <w:p>
+            <w:r>
+              <w:rPr>
+                <w:sz w:val="20"/>
+              </w:rPr>
+              <w:t>GLPI - sd.techvarejo.com.br</w:t>
+            </w:r>
+          </w:p>
+        </w:tc>
+      </w:tr>
+      <w:tr>
+        <w:tc>
+          <w:tcPr>
+            <w:tcW w:type="dxa" w:w="2880"/>
+          </w:tcPr>
+          <w:p>
+            <w:r>
+              <w:rPr>
+                <w:sz w:val="20"/>
+              </w:rPr>
+              <w:t>1.2</w:t>
+            </w:r>
+          </w:p>
+        </w:tc>
+        <w:tc>
+          <w:tcPr>
+            <w:tcW w:type="dxa" w:w="2880"/>
+          </w:tcPr>
+          <w:p>
+            <w:r>
+              <w:rPr>
+                <w:sz w:val="20"/>
+              </w:rPr>
+              <w:t>Classificar severidade inicial (padrão P2)</w:t>
+            </w:r>
+          </w:p>
+        </w:tc>
+        <w:tc>
+          <w:tcPr>
+            <w:tcW w:type="dxa" w:w="2880"/>
+          </w:tcPr>
+          <w:p>
+            <w:r>
+              <w:rPr>
+                <w:sz w:val="20"/>
+              </w:rPr>
+              <w:t>-</w:t>
+            </w:r>
+          </w:p>
+        </w:tc>
+      </w:tr>
+      <w:tr>
+        <w:tc>
+          <w:tcPr>
+            <w:tcW w:type="dxa" w:w="2880"/>
+          </w:tcPr>
+          <w:p>
+            <w:r>
+              <w:rPr>
+                <w:sz w:val="20"/>
+              </w:rPr>
+              <w:t>1.3</w:t>
+            </w:r>
+          </w:p>
+        </w:tc>
+        <w:tc>
+          <w:tcPr>
+            <w:tcW w:type="dxa" w:w="2880"/>
+          </w:tcPr>
+          <w:p>
+            <w:r>
+              <w:rPr>
+                <w:sz w:val="20"/>
+              </w:rPr>
+              <w:t>Verificar se remetente é interno ou externo</w:t>
+            </w:r>
+          </w:p>
+        </w:tc>
+        <w:tc>
+          <w:tcPr>
+            <w:tcW w:type="dxa" w:w="2880"/>
+          </w:tcPr>
+          <w:p>
+            <w:r>
+              <w:rPr>
+                <w:sz w:val="20"/>
+              </w:rPr>
+              <w:t>Análise do cabeçalho</w:t>
+            </w:r>
+          </w:p>
+        </w:tc>
+      </w:tr>
+      <w:tr>
+        <w:tc>
+          <w:tcPr>
+            <w:tcW w:type="dxa" w:w="2880"/>
+          </w:tcPr>
+          <w:p>
+            <w:r>
+              <w:rPr>
+                <w:sz w:val="20"/>
+              </w:rPr>
+              <w:t>1.4</w:t>
+            </w:r>
+          </w:p>
+        </w:tc>
+        <w:tc>
+          <w:tcPr>
+            <w:tcW w:type="dxa" w:w="2880"/>
+          </w:tcPr>
+          <w:p>
+            <w:r>
+              <w:rPr>
+                <w:sz w:val="20"/>
+              </w:rPr>
+              <w:t>Preservar e-mail original (exportar .eml)</w:t>
+            </w:r>
+          </w:p>
+        </w:tc>
+        <w:tc>
+          <w:tcPr>
+            <w:tcW w:type="dxa" w:w="2880"/>
+          </w:tcPr>
+          <w:p>
+            <w:r>
+              <w:rPr>
+                <w:sz w:val="20"/>
+              </w:rPr>
+              <w:t>O365 Admin</w:t>
+            </w:r>
+          </w:p>
+        </w:tc>
+      </w:tr>
+      <w:tr>
+        <w:tc>
+          <w:tcPr>
+            <w:tcW w:type="dxa" w:w="2880"/>
+          </w:tcPr>
+          <w:p>
+            <w:r>
+              <w:rPr>
+                <w:sz w:val="20"/>
+              </w:rPr>
+              <w:t>1.5</w:t>
+            </w:r>
+          </w:p>
+        </w:tc>
+        <w:tc>
+          <w:tcPr>
+            <w:tcW w:type="dxa" w:w="2880"/>
+          </w:tcPr>
+          <w:p>
+            <w:r>
+              <w:rPr>
+                <w:sz w:val="20"/>
+              </w:rPr>
+              <w:t>Confirmar que o e-mail existe no console</w:t>
+            </w:r>
+          </w:p>
+        </w:tc>
+        <w:tc>
+          <w:tcPr>
+            <w:tcW w:type="dxa" w:w="2880"/>
+          </w:tcPr>
+          <w:p>
+            <w:r>
+              <w:rPr>
+                <w:sz w:val="20"/>
+              </w:rPr>
+              <w:t>O365 Admin</w:t>
             </w:r>
           </w:p>
         </w:tc>
@@ -617,10 +1019,7 @@
         <w:pStyle w:val="Heading2"/>
       </w:pPr>
       <w:r>
-        <w:rPr>
-          <w:color w:val="1A3A5C"/>
-        </w:rPr>
-        <w:t>6. CRITERIOS DE ESCALONAMENTO (TechVarejo)</w:t>
+        <w:t>5.2 FASE 2 - ANÁLISE</w:t>
       </w:r>
     </w:p>
     <w:tbl>
@@ -631,47 +1030,56 @@
         <w:tblLook w:firstColumn="1" w:firstRow="1" w:lastColumn="0" w:lastRow="0" w:noHBand="0" w:noVBand="1" w:val="04A0"/>
       </w:tblPr>
       <w:tblGrid>
-        <w:gridCol w:w="3135"/>
-        <w:gridCol w:w="3135"/>
-        <w:gridCol w:w="3135"/>
+        <w:gridCol w:w="2880"/>
+        <w:gridCol w:w="2880"/>
+        <w:gridCol w:w="2880"/>
       </w:tblGrid>
       <w:tr>
         <w:tc>
           <w:tcPr>
-            <w:tcW w:type="dxa" w:w="3135"/>
+            <w:tcW w:type="dxa" w:w="2880"/>
+            <w:shd w:val="clear" w:color="auto" w:fill="1F4E79"/>
           </w:tcPr>
           <w:p>
             <w:r>
               <w:rPr>
                 <w:b/>
+                <w:color w:val="FFFFFF"/>
+                <w:sz w:val="20"/>
               </w:rPr>
-              <w:t>Gatilho</w:t>
+              <w:t>Passo</w:t>
             </w:r>
           </w:p>
         </w:tc>
         <w:tc>
           <w:tcPr>
-            <w:tcW w:type="dxa" w:w="3135"/>
+            <w:tcW w:type="dxa" w:w="2880"/>
+            <w:shd w:val="clear" w:color="auto" w:fill="1F4E79"/>
           </w:tcPr>
           <w:p>
             <w:r>
               <w:rPr>
                 <w:b/>
+                <w:color w:val="FFFFFF"/>
+                <w:sz w:val="20"/>
               </w:rPr>
-              <w:t>Escalar para</w:t>
+              <w:t>Ação</w:t>
             </w:r>
           </w:p>
         </w:tc>
         <w:tc>
           <w:tcPr>
-            <w:tcW w:type="dxa" w:w="3135"/>
+            <w:tcW w:type="dxa" w:w="2880"/>
+            <w:shd w:val="clear" w:color="auto" w:fill="1F4E79"/>
           </w:tcPr>
           <w:p>
             <w:r>
               <w:rPr>
                 <w:b/>
+                <w:color w:val="FFFFFF"/>
+                <w:sz w:val="20"/>
               </w:rPr>
-              <w:t>Tempo maximo</w:t>
+              <w:t>Ferramenta/Proced.</w:t>
             </w:r>
           </w:p>
         </w:tc>
@@ -679,31 +1087,40 @@
       <w:tr>
         <w:tc>
           <w:tcPr>
-            <w:tcW w:type="dxa" w:w="3135"/>
+            <w:tcW w:type="dxa" w:w="2880"/>
           </w:tcPr>
           <w:p>
             <w:r>
-              <w:t>E-mail enviado para +5 usuarios</w:t>
+              <w:rPr>
+                <w:sz w:val="20"/>
+              </w:rPr>
+              <w:t>2.1</w:t>
             </w:r>
           </w:p>
         </w:tc>
         <w:tc>
           <w:tcPr>
-            <w:tcW w:type="dxa" w:w="3135"/>
+            <w:tcW w:type="dxa" w:w="2880"/>
           </w:tcPr>
           <w:p>
             <w:r>
-              <w:t>N2</w:t>
+              <w:rPr>
+                <w:sz w:val="20"/>
+              </w:rPr>
+              <w:t>Analisar cabeçalhos (Received, From, Return-Path, SPF, DKIM, DMARC)</w:t>
             </w:r>
           </w:p>
         </w:tc>
         <w:tc>
           <w:tcPr>
-            <w:tcW w:type="dxa" w:w="3135"/>
+            <w:tcW w:type="dxa" w:w="2880"/>
           </w:tcPr>
           <w:p>
             <w:r>
-              <w:t>15 minutos</w:t>
+              <w:rPr>
+                <w:sz w:val="20"/>
+              </w:rPr>
+              <w:t>MxToolbox ou PROC-SEC-012</w:t>
             </w:r>
           </w:p>
         </w:tc>
@@ -711,31 +1128,40 @@
       <w:tr>
         <w:tc>
           <w:tcPr>
-            <w:tcW w:type="dxa" w:w="3135"/>
+            <w:tcW w:type="dxa" w:w="2880"/>
           </w:tcPr>
           <w:p>
             <w:r>
-              <w:t>Usuario inseriu credenciais</w:t>
+              <w:rPr>
+                <w:sz w:val="20"/>
+              </w:rPr>
+              <w:t>2.2</w:t>
             </w:r>
           </w:p>
         </w:tc>
         <w:tc>
           <w:tcPr>
-            <w:tcW w:type="dxa" w:w="3135"/>
+            <w:tcW w:type="dxa" w:w="2880"/>
           </w:tcPr>
           <w:p>
             <w:r>
-              <w:t>N2 + IC</w:t>
+              <w:rPr>
+                <w:sz w:val="20"/>
+              </w:rPr>
+              <w:t>Extrair URLs e verificar reputação</w:t>
             </w:r>
           </w:p>
         </w:tc>
         <w:tc>
           <w:tcPr>
-            <w:tcW w:type="dxa" w:w="3135"/>
+            <w:tcW w:type="dxa" w:w="2880"/>
           </w:tcPr>
           <w:p>
             <w:r>
-              <w:t>15 minutos</w:t>
+              <w:rPr>
+                <w:sz w:val="20"/>
+              </w:rPr>
+              <w:t>URLscan.io, VT Ent.</w:t>
             </w:r>
           </w:p>
         </w:tc>
@@ -743,31 +1169,40 @@
       <w:tr>
         <w:tc>
           <w:tcPr>
-            <w:tcW w:type="dxa" w:w="3135"/>
+            <w:tcW w:type="dxa" w:w="2880"/>
           </w:tcPr>
           <w:p>
             <w:r>
-              <w:t>Remetente interno (conta compr.)</w:t>
+              <w:rPr>
+                <w:sz w:val="20"/>
+              </w:rPr>
+              <w:t>2.3</w:t>
             </w:r>
           </w:p>
         </w:tc>
         <w:tc>
           <w:tcPr>
-            <w:tcW w:type="dxa" w:w="3135"/>
+            <w:tcW w:type="dxa" w:w="2880"/>
           </w:tcPr>
           <w:p>
             <w:r>
-              <w:t>IC</w:t>
+              <w:rPr>
+                <w:sz w:val="20"/>
+              </w:rPr>
+              <w:t>Extrair anexos, calcular hash SHA256</w:t>
             </w:r>
           </w:p>
         </w:tc>
         <w:tc>
           <w:tcPr>
-            <w:tcW w:type="dxa" w:w="3135"/>
+            <w:tcW w:type="dxa" w:w="2880"/>
           </w:tcPr>
           <w:p>
             <w:r>
-              <w:t>Imediato</w:t>
+              <w:rPr>
+                <w:sz w:val="20"/>
+              </w:rPr>
+              <w:t>PROC-SEC-016, VT Ent.</w:t>
             </w:r>
           </w:p>
         </w:tc>
@@ -775,31 +1210,40 @@
       <w:tr>
         <w:tc>
           <w:tcPr>
-            <w:tcW w:type="dxa" w:w="3135"/>
+            <w:tcW w:type="dxa" w:w="2880"/>
           </w:tcPr>
           <w:p>
             <w:r>
-              <w:t>Malware detectado em anexo</w:t>
+              <w:rPr>
+                <w:sz w:val="20"/>
+              </w:rPr>
+              <w:t>2.4</w:t>
             </w:r>
           </w:p>
         </w:tc>
         <w:tc>
           <w:tcPr>
-            <w:tcW w:type="dxa" w:w="3135"/>
+            <w:tcW w:type="dxa" w:w="2880"/>
           </w:tcPr>
           <w:p>
             <w:r>
-              <w:t>N2 + IC</w:t>
+              <w:rPr>
+                <w:sz w:val="20"/>
+              </w:rPr>
+              <w:t>Verificar typosquatting no domínio</w:t>
             </w:r>
           </w:p>
         </w:tc>
         <w:tc>
           <w:tcPr>
-            <w:tcW w:type="dxa" w:w="3135"/>
+            <w:tcW w:type="dxa" w:w="2880"/>
           </w:tcPr>
           <w:p>
             <w:r>
-              <w:t>Imediato</w:t>
+              <w:rPr>
+                <w:sz w:val="20"/>
+              </w:rPr>
+              <w:t>whois, análise visual</w:t>
             </w:r>
           </w:p>
         </w:tc>
@@ -807,31 +1251,81 @@
       <w:tr>
         <w:tc>
           <w:tcPr>
-            <w:tcW w:type="dxa" w:w="3135"/>
+            <w:tcW w:type="dxa" w:w="2880"/>
           </w:tcPr>
           <w:p>
             <w:r>
-              <w:t>Spear phishing contra C-level</w:t>
+              <w:rPr>
+                <w:sz w:val="20"/>
+              </w:rPr>
+              <w:t>2.5</w:t>
             </w:r>
           </w:p>
         </w:tc>
         <w:tc>
           <w:tcPr>
-            <w:tcW w:type="dxa" w:w="3135"/>
+            <w:tcW w:type="dxa" w:w="2880"/>
           </w:tcPr>
           <w:p>
             <w:r>
-              <w:t>N2 + IC</w:t>
+              <w:rPr>
+                <w:sz w:val="20"/>
+              </w:rPr>
+              <w:t>Verificar outros destinatários no Splunk</w:t>
             </w:r>
           </w:p>
         </w:tc>
         <w:tc>
           <w:tcPr>
-            <w:tcW w:type="dxa" w:w="3135"/>
+            <w:tcW w:type="dxa" w:w="2880"/>
           </w:tcPr>
           <w:p>
             <w:r>
-              <w:t>Imediato</w:t>
+              <w:rPr>
+                <w:sz w:val="20"/>
+              </w:rPr>
+              <w:t>Splunk</w:t>
+            </w:r>
+          </w:p>
+        </w:tc>
+      </w:tr>
+      <w:tr>
+        <w:tc>
+          <w:tcPr>
+            <w:tcW w:type="dxa" w:w="2880"/>
+          </w:tcPr>
+          <w:p>
+            <w:r>
+              <w:rPr>
+                <w:sz w:val="20"/>
+              </w:rPr>
+              <w:t>2.6</w:t>
+            </w:r>
+          </w:p>
+        </w:tc>
+        <w:tc>
+          <w:tcPr>
+            <w:tcW w:type="dxa" w:w="2880"/>
+          </w:tcPr>
+          <w:p>
+            <w:r>
+              <w:rPr>
+                <w:sz w:val="20"/>
+              </w:rPr>
+              <w:t>Determinar interação do usuário</w:t>
+            </w:r>
+          </w:p>
+        </w:tc>
+        <w:tc>
+          <w:tcPr>
+            <w:tcW w:type="dxa" w:w="2880"/>
+          </w:tcPr>
+          <w:p>
+            <w:r>
+              <w:rPr>
+                <w:sz w:val="20"/>
+              </w:rPr>
+              <w:t>Entrevista + Azure AD</w:t>
             </w:r>
           </w:p>
         </w:tc>
@@ -843,67 +1337,1033 @@
         <w:pStyle w:val="Heading2"/>
       </w:pPr>
       <w:r>
+        <w:t>5.3 FASE 3 - CONTENÇÃO</w:t>
+      </w:r>
+    </w:p>
+    <w:tbl>
+      <w:tblPr>
+        <w:tblStyle w:val="TableGrid"/>
+        <w:tblW w:type="auto" w:w="0"/>
+        <w:jc w:val="center"/>
+        <w:tblLook w:firstColumn="1" w:firstRow="1" w:lastColumn="0" w:lastRow="0" w:noHBand="0" w:noVBand="1" w:val="04A0"/>
+      </w:tblPr>
+      <w:tblGrid>
+        <w:gridCol w:w="2880"/>
+        <w:gridCol w:w="2880"/>
+        <w:gridCol w:w="2880"/>
+      </w:tblGrid>
+      <w:tr>
+        <w:tc>
+          <w:tcPr>
+            <w:tcW w:type="dxa" w:w="2880"/>
+            <w:shd w:val="clear" w:color="auto" w:fill="1F4E79"/>
+          </w:tcPr>
+          <w:p>
+            <w:r>
+              <w:rPr>
+                <w:b/>
+                <w:color w:val="FFFFFF"/>
+                <w:sz w:val="20"/>
+              </w:rPr>
+              <w:t>Passo</w:t>
+            </w:r>
+          </w:p>
+        </w:tc>
+        <w:tc>
+          <w:tcPr>
+            <w:tcW w:type="dxa" w:w="2880"/>
+            <w:shd w:val="clear" w:color="auto" w:fill="1F4E79"/>
+          </w:tcPr>
+          <w:p>
+            <w:r>
+              <w:rPr>
+                <w:b/>
+                <w:color w:val="FFFFFF"/>
+                <w:sz w:val="20"/>
+              </w:rPr>
+              <w:t>Ação</w:t>
+            </w:r>
+          </w:p>
+        </w:tc>
+        <w:tc>
+          <w:tcPr>
+            <w:tcW w:type="dxa" w:w="2880"/>
+            <w:shd w:val="clear" w:color="auto" w:fill="1F4E79"/>
+          </w:tcPr>
+          <w:p>
+            <w:r>
+              <w:rPr>
+                <w:b/>
+                <w:color w:val="FFFFFF"/>
+                <w:sz w:val="20"/>
+              </w:rPr>
+              <w:t>Ferramenta/Proced.</w:t>
+            </w:r>
+          </w:p>
+        </w:tc>
+      </w:tr>
+      <w:tr>
+        <w:tc>
+          <w:tcPr>
+            <w:tcW w:type="dxa" w:w="2880"/>
+          </w:tcPr>
+          <w:p>
+            <w:r>
+              <w:rPr>
+                <w:sz w:val="20"/>
+              </w:rPr>
+              <w:t>3.1</w:t>
+            </w:r>
+          </w:p>
+        </w:tc>
+        <w:tc>
+          <w:tcPr>
+            <w:tcW w:type="dxa" w:w="2880"/>
+          </w:tcPr>
+          <w:p>
+            <w:r>
+              <w:rPr>
+                <w:sz w:val="20"/>
+              </w:rPr>
+              <w:t>SE credenciais inseridas: reset + MFA</w:t>
+            </w:r>
+          </w:p>
+        </w:tc>
+        <w:tc>
+          <w:tcPr>
+            <w:tcW w:type="dxa" w:w="2880"/>
+          </w:tcPr>
+          <w:p>
+            <w:r>
+              <w:rPr>
+                <w:sz w:val="20"/>
+              </w:rPr>
+              <w:t>PROC-SEC-004/007</w:t>
+            </w:r>
+          </w:p>
+        </w:tc>
+      </w:tr>
+      <w:tr>
+        <w:tc>
+          <w:tcPr>
+            <w:tcW w:type="dxa" w:w="2880"/>
+          </w:tcPr>
+          <w:p>
+            <w:r>
+              <w:rPr>
+                <w:sz w:val="20"/>
+              </w:rPr>
+              <w:t>3.2</w:t>
+            </w:r>
+          </w:p>
+        </w:tc>
+        <w:tc>
+          <w:tcPr>
+            <w:tcW w:type="dxa" w:w="2880"/>
+          </w:tcPr>
+          <w:p>
+            <w:r>
+              <w:rPr>
+                <w:sz w:val="20"/>
+              </w:rPr>
+              <w:t>Remover regras de redirecionamento</w:t>
+            </w:r>
+          </w:p>
+        </w:tc>
+        <w:tc>
+          <w:tcPr>
+            <w:tcW w:type="dxa" w:w="2880"/>
+          </w:tcPr>
+          <w:p>
+            <w:r>
+              <w:rPr>
+                <w:sz w:val="20"/>
+              </w:rPr>
+              <w:t>PROC-SEC-003</w:t>
+            </w:r>
+          </w:p>
+        </w:tc>
+      </w:tr>
+      <w:tr>
+        <w:tc>
+          <w:tcPr>
+            <w:tcW w:type="dxa" w:w="2880"/>
+          </w:tcPr>
+          <w:p>
+            <w:r>
+              <w:rPr>
+                <w:sz w:val="20"/>
+              </w:rPr>
+              <w:t>3.3</w:t>
+            </w:r>
+          </w:p>
+        </w:tc>
+        <w:tc>
+          <w:tcPr>
+            <w:tcW w:type="dxa" w:w="2880"/>
+          </w:tcPr>
+          <w:p>
+            <w:r>
+              <w:rPr>
+                <w:sz w:val="20"/>
+              </w:rPr>
+              <w:t>Bloquear remetente no Mimecast</w:t>
+            </w:r>
+          </w:p>
+        </w:tc>
+        <w:tc>
+          <w:tcPr>
+            <w:tcW w:type="dxa" w:w="2880"/>
+          </w:tcPr>
+          <w:p>
+            <w:r>
+              <w:rPr>
+                <w:sz w:val="20"/>
+              </w:rPr>
+              <w:t>PROC-SEC-009</w:t>
+            </w:r>
+          </w:p>
+        </w:tc>
+      </w:tr>
+      <w:tr>
+        <w:tc>
+          <w:tcPr>
+            <w:tcW w:type="dxa" w:w="2880"/>
+          </w:tcPr>
+          <w:p>
+            <w:r>
+              <w:rPr>
+                <w:sz w:val="20"/>
+              </w:rPr>
+              <w:t>3.4</w:t>
+            </w:r>
+          </w:p>
+        </w:tc>
+        <w:tc>
+          <w:tcPr>
+            <w:tcW w:type="dxa" w:w="2880"/>
+          </w:tcPr>
+          <w:p>
+            <w:r>
+              <w:rPr>
+                <w:sz w:val="20"/>
+              </w:rPr>
+              <w:t>SE URLs maliciosas: bloquear no Zscaler</w:t>
+            </w:r>
+          </w:p>
+        </w:tc>
+        <w:tc>
+          <w:tcPr>
+            <w:tcW w:type="dxa" w:w="2880"/>
+          </w:tcPr>
+          <w:p>
+            <w:r>
+              <w:rPr>
+                <w:sz w:val="20"/>
+              </w:rPr>
+              <w:t>PROC-SEC-015</w:t>
+            </w:r>
+          </w:p>
+        </w:tc>
+      </w:tr>
+    </w:tbl>
+    <w:p/>
+    <w:p>
+      <w:pPr>
+        <w:pStyle w:val="Heading2"/>
+      </w:pPr>
+      <w:r>
+        <w:t>5.4 FASE 4 - ERRADICAÇÃO</w:t>
+      </w:r>
+    </w:p>
+    <w:tbl>
+      <w:tblPr>
+        <w:tblStyle w:val="TableGrid"/>
+        <w:tblW w:type="auto" w:w="0"/>
+        <w:jc w:val="center"/>
+        <w:tblLook w:firstColumn="1" w:firstRow="1" w:lastColumn="0" w:lastRow="0" w:noHBand="0" w:noVBand="1" w:val="04A0"/>
+      </w:tblPr>
+      <w:tblGrid>
+        <w:gridCol w:w="2880"/>
+        <w:gridCol w:w="2880"/>
+        <w:gridCol w:w="2880"/>
+      </w:tblGrid>
+      <w:tr>
+        <w:tc>
+          <w:tcPr>
+            <w:tcW w:type="dxa" w:w="2880"/>
+            <w:shd w:val="clear" w:color="auto" w:fill="1F4E79"/>
+          </w:tcPr>
+          <w:p>
+            <w:r>
+              <w:rPr>
+                <w:b/>
+                <w:color w:val="FFFFFF"/>
+                <w:sz w:val="20"/>
+              </w:rPr>
+              <w:t>Passo</w:t>
+            </w:r>
+          </w:p>
+        </w:tc>
+        <w:tc>
+          <w:tcPr>
+            <w:tcW w:type="dxa" w:w="2880"/>
+            <w:shd w:val="clear" w:color="auto" w:fill="1F4E79"/>
+          </w:tcPr>
+          <w:p>
+            <w:r>
+              <w:rPr>
+                <w:b/>
+                <w:color w:val="FFFFFF"/>
+                <w:sz w:val="20"/>
+              </w:rPr>
+              <w:t>Ação</w:t>
+            </w:r>
+          </w:p>
+        </w:tc>
+        <w:tc>
+          <w:tcPr>
+            <w:tcW w:type="dxa" w:w="2880"/>
+            <w:shd w:val="clear" w:color="auto" w:fill="1F4E79"/>
+          </w:tcPr>
+          <w:p>
+            <w:r>
+              <w:rPr>
+                <w:b/>
+                <w:color w:val="FFFFFF"/>
+                <w:sz w:val="20"/>
+              </w:rPr>
+              <w:t>Ferramenta/Proced.</w:t>
+            </w:r>
+          </w:p>
+        </w:tc>
+      </w:tr>
+      <w:tr>
+        <w:tc>
+          <w:tcPr>
+            <w:tcW w:type="dxa" w:w="2880"/>
+          </w:tcPr>
+          <w:p>
+            <w:r>
+              <w:rPr>
+                <w:sz w:val="20"/>
+              </w:rPr>
+              <w:t>4.1</w:t>
+            </w:r>
+          </w:p>
+        </w:tc>
+        <w:tc>
+          <w:tcPr>
+            <w:tcW w:type="dxa" w:w="2880"/>
+          </w:tcPr>
+          <w:p>
+            <w:r>
+              <w:rPr>
+                <w:sz w:val="20"/>
+              </w:rPr>
+              <w:t>Remover e-mail de TODAS as caixas</w:t>
+            </w:r>
+          </w:p>
+        </w:tc>
+        <w:tc>
+          <w:tcPr>
+            <w:tcW w:type="dxa" w:w="2880"/>
+          </w:tcPr>
+          <w:p>
+            <w:r>
+              <w:rPr>
+                <w:sz w:val="20"/>
+              </w:rPr>
+              <w:t>O365 Admin</w:t>
+            </w:r>
+          </w:p>
+        </w:tc>
+      </w:tr>
+      <w:tr>
+        <w:tc>
+          <w:tcPr>
+            <w:tcW w:type="dxa" w:w="2880"/>
+          </w:tcPr>
+          <w:p>
+            <w:r>
+              <w:rPr>
+                <w:sz w:val="20"/>
+              </w:rPr>
+              <w:t>4.2</w:t>
+            </w:r>
+          </w:p>
+        </w:tc>
+        <w:tc>
+          <w:tcPr>
+            <w:tcW w:type="dxa" w:w="2880"/>
+          </w:tcPr>
+          <w:p>
+            <w:r>
+              <w:rPr>
+                <w:sz w:val="20"/>
+              </w:rPr>
+              <w:t>SE malware executado: acionar PB-002</w:t>
+            </w:r>
+          </w:p>
+        </w:tc>
+        <w:tc>
+          <w:tcPr>
+            <w:tcW w:type="dxa" w:w="2880"/>
+          </w:tcPr>
+          <w:p>
+            <w:r>
+              <w:rPr>
+                <w:sz w:val="20"/>
+              </w:rPr>
+              <w:t>PB-002</w:t>
+            </w:r>
+          </w:p>
+        </w:tc>
+      </w:tr>
+      <w:tr>
+        <w:tc>
+          <w:tcPr>
+            <w:tcW w:type="dxa" w:w="2880"/>
+          </w:tcPr>
+          <w:p>
+            <w:r>
+              <w:rPr>
+                <w:sz w:val="20"/>
+              </w:rPr>
+              <w:t>4.3</w:t>
+            </w:r>
+          </w:p>
+        </w:tc>
+        <w:tc>
+          <w:tcPr>
+            <w:tcW w:type="dxa" w:w="2880"/>
+          </w:tcPr>
+          <w:p>
+            <w:r>
+              <w:rPr>
+                <w:sz w:val="20"/>
+              </w:rPr>
+              <w:t>Invalidar tokens OAuth do usuário</w:t>
+            </w:r>
+          </w:p>
+        </w:tc>
+        <w:tc>
+          <w:tcPr>
+            <w:tcW w:type="dxa" w:w="2880"/>
+          </w:tcPr>
+          <w:p>
+            <w:r>
+              <w:rPr>
+                <w:sz w:val="20"/>
+              </w:rPr>
+              <w:t>PROC-SEC-007</w:t>
+            </w:r>
+          </w:p>
+        </w:tc>
+      </w:tr>
+    </w:tbl>
+    <w:p/>
+    <w:p>
+      <w:pPr>
+        <w:pStyle w:val="Heading2"/>
+      </w:pPr>
+      <w:r>
+        <w:t>5.5 FASE 5 - RECUPERAÇÃO</w:t>
+      </w:r>
+    </w:p>
+    <w:tbl>
+      <w:tblPr>
+        <w:tblStyle w:val="TableGrid"/>
+        <w:tblW w:type="auto" w:w="0"/>
+        <w:jc w:val="center"/>
+        <w:tblLook w:firstColumn="1" w:firstRow="1" w:lastColumn="0" w:lastRow="0" w:noHBand="0" w:noVBand="1" w:val="04A0"/>
+      </w:tblPr>
+      <w:tblGrid>
+        <w:gridCol w:w="2880"/>
+        <w:gridCol w:w="2880"/>
+        <w:gridCol w:w="2880"/>
+      </w:tblGrid>
+      <w:tr>
+        <w:tc>
+          <w:tcPr>
+            <w:tcW w:type="dxa" w:w="2880"/>
+            <w:shd w:val="clear" w:color="auto" w:fill="1F4E79"/>
+          </w:tcPr>
+          <w:p>
+            <w:r>
+              <w:rPr>
+                <w:b/>
+                <w:color w:val="FFFFFF"/>
+                <w:sz w:val="20"/>
+              </w:rPr>
+              <w:t>Passo</w:t>
+            </w:r>
+          </w:p>
+        </w:tc>
+        <w:tc>
+          <w:tcPr>
+            <w:tcW w:type="dxa" w:w="2880"/>
+            <w:shd w:val="clear" w:color="auto" w:fill="1F4E79"/>
+          </w:tcPr>
+          <w:p>
+            <w:r>
+              <w:rPr>
+                <w:b/>
+                <w:color w:val="FFFFFF"/>
+                <w:sz w:val="20"/>
+              </w:rPr>
+              <w:t>Ação</w:t>
+            </w:r>
+          </w:p>
+        </w:tc>
+        <w:tc>
+          <w:tcPr>
+            <w:tcW w:type="dxa" w:w="2880"/>
+            <w:shd w:val="clear" w:color="auto" w:fill="1F4E79"/>
+          </w:tcPr>
+          <w:p>
+            <w:r>
+              <w:rPr>
+                <w:b/>
+                <w:color w:val="FFFFFF"/>
+                <w:sz w:val="20"/>
+              </w:rPr>
+              <w:t>Ferramenta/Proced.</w:t>
+            </w:r>
+          </w:p>
+        </w:tc>
+      </w:tr>
+      <w:tr>
+        <w:tc>
+          <w:tcPr>
+            <w:tcW w:type="dxa" w:w="2880"/>
+          </w:tcPr>
+          <w:p>
+            <w:r>
+              <w:rPr>
+                <w:sz w:val="20"/>
+              </w:rPr>
+              <w:t>5.1</w:t>
+            </w:r>
+          </w:p>
+        </w:tc>
+        <w:tc>
+          <w:tcPr>
+            <w:tcW w:type="dxa" w:w="2880"/>
+          </w:tcPr>
+          <w:p>
+            <w:r>
+              <w:rPr>
+                <w:sz w:val="20"/>
+              </w:rPr>
+              <w:t>Confirmar que usuário acessa e-mail</w:t>
+            </w:r>
+          </w:p>
+        </w:tc>
+        <w:tc>
+          <w:tcPr>
+            <w:tcW w:type="dxa" w:w="2880"/>
+          </w:tcPr>
+          <w:p>
+            <w:r>
+              <w:rPr>
+                <w:sz w:val="20"/>
+              </w:rPr>
+              <w:t>O365 Admin</w:t>
+            </w:r>
+          </w:p>
+        </w:tc>
+      </w:tr>
+      <w:tr>
+        <w:tc>
+          <w:tcPr>
+            <w:tcW w:type="dxa" w:w="2880"/>
+          </w:tcPr>
+          <w:p>
+            <w:r>
+              <w:rPr>
+                <w:sz w:val="20"/>
+              </w:rPr>
+              <w:t>5.2</w:t>
+            </w:r>
+          </w:p>
+        </w:tc>
+        <w:tc>
+          <w:tcPr>
+            <w:tcW w:type="dxa" w:w="2880"/>
+          </w:tcPr>
+          <w:p>
+            <w:r>
+              <w:rPr>
+                <w:sz w:val="20"/>
+              </w:rPr>
+              <w:t>Comunicar ao usuário (template COM-003)</w:t>
+            </w:r>
+          </w:p>
+        </w:tc>
+        <w:tc>
+          <w:tcPr>
+            <w:tcW w:type="dxa" w:w="2880"/>
+          </w:tcPr>
+          <w:p>
+            <w:r>
+              <w:rPr>
+                <w:sz w:val="20"/>
+              </w:rPr>
+              <w:t>E-mail / GLPI</w:t>
+            </w:r>
+          </w:p>
+        </w:tc>
+      </w:tr>
+    </w:tbl>
+    <w:p/>
+    <w:p>
+      <w:pPr>
+        <w:pStyle w:val="Heading1"/>
+      </w:pPr>
+      <w:r>
+        <w:t>6. CRITÉRIOS DE ESCALONAMENTO (TechVarejo)</w:t>
+      </w:r>
+    </w:p>
+    <w:tbl>
+      <w:tblPr>
+        <w:tblStyle w:val="TableGrid"/>
+        <w:tblW w:type="auto" w:w="0"/>
+        <w:jc w:val="center"/>
+        <w:tblLook w:firstColumn="1" w:firstRow="1" w:lastColumn="0" w:lastRow="0" w:noHBand="0" w:noVBand="1" w:val="04A0"/>
+      </w:tblPr>
+      <w:tblGrid>
+        <w:gridCol w:w="2880"/>
+        <w:gridCol w:w="2880"/>
+        <w:gridCol w:w="2880"/>
+      </w:tblGrid>
+      <w:tr>
+        <w:tc>
+          <w:tcPr>
+            <w:tcW w:type="dxa" w:w="2880"/>
+            <w:shd w:val="clear" w:color="auto" w:fill="1F4E79"/>
+          </w:tcPr>
+          <w:p>
+            <w:r>
+              <w:rPr>
+                <w:b/>
+                <w:color w:val="FFFFFF"/>
+                <w:sz w:val="20"/>
+              </w:rPr>
+              <w:t>Gatilho</w:t>
+            </w:r>
+          </w:p>
+        </w:tc>
+        <w:tc>
+          <w:tcPr>
+            <w:tcW w:type="dxa" w:w="2880"/>
+            <w:shd w:val="clear" w:color="auto" w:fill="1F4E79"/>
+          </w:tcPr>
+          <w:p>
+            <w:r>
+              <w:rPr>
+                <w:b/>
+                <w:color w:val="FFFFFF"/>
+                <w:sz w:val="20"/>
+              </w:rPr>
+              <w:t>Escalar para</w:t>
+            </w:r>
+          </w:p>
+        </w:tc>
+        <w:tc>
+          <w:tcPr>
+            <w:tcW w:type="dxa" w:w="2880"/>
+            <w:shd w:val="clear" w:color="auto" w:fill="1F4E79"/>
+          </w:tcPr>
+          <w:p>
+            <w:r>
+              <w:rPr>
+                <w:b/>
+                <w:color w:val="FFFFFF"/>
+                <w:sz w:val="20"/>
+              </w:rPr>
+              <w:t>Tempo máximo</w:t>
+            </w:r>
+          </w:p>
+        </w:tc>
+      </w:tr>
+      <w:tr>
+        <w:tc>
+          <w:tcPr>
+            <w:tcW w:type="dxa" w:w="2880"/>
+          </w:tcPr>
+          <w:p>
+            <w:r>
+              <w:rPr>
+                <w:sz w:val="20"/>
+              </w:rPr>
+              <w:t>E-mail enviado para +5 usuários</w:t>
+            </w:r>
+          </w:p>
+        </w:tc>
+        <w:tc>
+          <w:tcPr>
+            <w:tcW w:type="dxa" w:w="2880"/>
+          </w:tcPr>
+          <w:p>
+            <w:r>
+              <w:rPr>
+                <w:sz w:val="20"/>
+              </w:rPr>
+              <w:t>N2</w:t>
+            </w:r>
+          </w:p>
+        </w:tc>
+        <w:tc>
+          <w:tcPr>
+            <w:tcW w:type="dxa" w:w="2880"/>
+          </w:tcPr>
+          <w:p>
+            <w:r>
+              <w:rPr>
+                <w:sz w:val="20"/>
+              </w:rPr>
+              <w:t>15 minutos</w:t>
+            </w:r>
+          </w:p>
+        </w:tc>
+      </w:tr>
+      <w:tr>
+        <w:tc>
+          <w:tcPr>
+            <w:tcW w:type="dxa" w:w="2880"/>
+          </w:tcPr>
+          <w:p>
+            <w:r>
+              <w:rPr>
+                <w:sz w:val="20"/>
+              </w:rPr>
+              <w:t>Usuário inseriu credenciais</w:t>
+            </w:r>
+          </w:p>
+        </w:tc>
+        <w:tc>
+          <w:tcPr>
+            <w:tcW w:type="dxa" w:w="2880"/>
+          </w:tcPr>
+          <w:p>
+            <w:r>
+              <w:rPr>
+                <w:sz w:val="20"/>
+              </w:rPr>
+              <w:t>N2 + IC</w:t>
+            </w:r>
+          </w:p>
+        </w:tc>
+        <w:tc>
+          <w:tcPr>
+            <w:tcW w:type="dxa" w:w="2880"/>
+          </w:tcPr>
+          <w:p>
+            <w:r>
+              <w:rPr>
+                <w:sz w:val="20"/>
+              </w:rPr>
+              <w:t>15 minutos</w:t>
+            </w:r>
+          </w:p>
+        </w:tc>
+      </w:tr>
+      <w:tr>
+        <w:tc>
+          <w:tcPr>
+            <w:tcW w:type="dxa" w:w="2880"/>
+          </w:tcPr>
+          <w:p>
+            <w:r>
+              <w:rPr>
+                <w:sz w:val="20"/>
+              </w:rPr>
+              <w:t>Remetente interno (conta comprometida)</w:t>
+            </w:r>
+          </w:p>
+        </w:tc>
+        <w:tc>
+          <w:tcPr>
+            <w:tcW w:type="dxa" w:w="2880"/>
+          </w:tcPr>
+          <w:p>
+            <w:r>
+              <w:rPr>
+                <w:sz w:val="20"/>
+              </w:rPr>
+              <w:t>IC</w:t>
+            </w:r>
+          </w:p>
+        </w:tc>
+        <w:tc>
+          <w:tcPr>
+            <w:tcW w:type="dxa" w:w="2880"/>
+          </w:tcPr>
+          <w:p>
+            <w:r>
+              <w:rPr>
+                <w:sz w:val="20"/>
+              </w:rPr>
+              <w:t>Imediato</w:t>
+            </w:r>
+          </w:p>
+        </w:tc>
+      </w:tr>
+      <w:tr>
+        <w:tc>
+          <w:tcPr>
+            <w:tcW w:type="dxa" w:w="2880"/>
+          </w:tcPr>
+          <w:p>
+            <w:r>
+              <w:rPr>
+                <w:sz w:val="20"/>
+              </w:rPr>
+              <w:t>Malware detectado em anexo</w:t>
+            </w:r>
+          </w:p>
+        </w:tc>
+        <w:tc>
+          <w:tcPr>
+            <w:tcW w:type="dxa" w:w="2880"/>
+          </w:tcPr>
+          <w:p>
+            <w:r>
+              <w:rPr>
+                <w:sz w:val="20"/>
+              </w:rPr>
+              <w:t>N2 + IC</w:t>
+            </w:r>
+          </w:p>
+        </w:tc>
+        <w:tc>
+          <w:tcPr>
+            <w:tcW w:type="dxa" w:w="2880"/>
+          </w:tcPr>
+          <w:p>
+            <w:r>
+              <w:rPr>
+                <w:sz w:val="20"/>
+              </w:rPr>
+              <w:t>Imediato</w:t>
+            </w:r>
+          </w:p>
+        </w:tc>
+      </w:tr>
+      <w:tr>
+        <w:tc>
+          <w:tcPr>
+            <w:tcW w:type="dxa" w:w="2880"/>
+          </w:tcPr>
+          <w:p>
+            <w:r>
+              <w:rPr>
+                <w:sz w:val="20"/>
+              </w:rPr>
+              <w:t>Spear phishing contra C-level</w:t>
+            </w:r>
+          </w:p>
+        </w:tc>
+        <w:tc>
+          <w:tcPr>
+            <w:tcW w:type="dxa" w:w="2880"/>
+          </w:tcPr>
+          <w:p>
+            <w:r>
+              <w:rPr>
+                <w:sz w:val="20"/>
+              </w:rPr>
+              <w:t>N2 + IC</w:t>
+            </w:r>
+          </w:p>
+        </w:tc>
+        <w:tc>
+          <w:tcPr>
+            <w:tcW w:type="dxa" w:w="2880"/>
+          </w:tcPr>
+          <w:p>
+            <w:r>
+              <w:rPr>
+                <w:sz w:val="20"/>
+              </w:rPr>
+              <w:t>Imediato</w:t>
+            </w:r>
+          </w:p>
+        </w:tc>
+      </w:tr>
+    </w:tbl>
+    <w:p/>
+    <w:p>
+      <w:pPr>
+        <w:pStyle w:val="Heading1"/>
+      </w:pPr>
+      <w:r>
+        <w:t>7. CRITÉRIOS DE ENCERRAMENTO</w:t>
+      </w:r>
+    </w:p>
+    <w:p>
+      <w:pPr>
+        <w:pStyle w:val="ListBullet"/>
+      </w:pPr>
+      <w:r>
+        <w:t>[ ] Todos os destinatários identificados e notificados</w:t>
+      </w:r>
+    </w:p>
+    <w:p>
+      <w:pPr>
+        <w:pStyle w:val="ListBullet"/>
+      </w:pPr>
+      <w:r>
+        <w:t>[ ] E-mails maliciosos removidos de todas as caixas</w:t>
+      </w:r>
+    </w:p>
+    <w:p>
+      <w:pPr>
+        <w:pStyle w:val="ListBullet"/>
+      </w:pPr>
+      <w:r>
+        <w:t>[ ] Credenciais resetadas (se aplicável)</w:t>
+      </w:r>
+    </w:p>
+    <w:p>
+      <w:pPr>
+        <w:pStyle w:val="ListBullet"/>
+      </w:pPr>
+      <w:r>
+        <w:t>[ ] Remetente e URLs bloqueados</w:t>
+      </w:r>
+    </w:p>
+    <w:p>
+      <w:pPr>
+        <w:pStyle w:val="ListBullet"/>
+      </w:pPr>
+      <w:r>
+        <w:t>[ ] Documentação concluída no GLPI</w:t>
+      </w:r>
+    </w:p>
+    <w:p>
+      <w:pPr>
+        <w:pStyle w:val="ListBullet"/>
+      </w:pPr>
+      <w:r>
+        <w:t>[ ] Lições aprendidas registradas</w:t>
+      </w:r>
+    </w:p>
+    <w:p/>
+    <w:p>
+      <w:pPr>
+        <w:pStyle w:val="Heading1"/>
+      </w:pPr>
+      <w:r>
+        <w:t>8. TEMPLATE COM-003 (ADAPTADO)</w:t>
+      </w:r>
+    </w:p>
+    <w:p/>
+    <w:p>
+      <w:r>
         <w:rPr>
-          <w:color w:val="1A3A5C"/>
+          <w:b/>
         </w:rPr>
-        <w:t>8. TEMPLATE COM-003 (ADAPTADO)</w:t>
+        <w:t>Assunto: Incidente de Segurança - E-mail Suspeito Reportado</w:t>
+      </w:r>
+    </w:p>
+    <w:p/>
+    <w:p>
+      <w:r>
+        <w:t>Prezado(a) [NOME],</w:t>
+      </w:r>
+    </w:p>
+    <w:p>
+      <w:r>
+        <w:t>O e-mail com assunto "[ASSUNTO]" que você reportou foi analisado pela equipe de Segurança da Informação e confirmado como malicioso.</w:t>
+      </w:r>
+    </w:p>
+    <w:p/>
+    <w:p>
+      <w:r>
+        <w:rPr>
+          <w:b/>
+        </w:rPr>
+        <w:t>Ações tomadas:</w:t>
+      </w:r>
+    </w:p>
+    <w:p>
+      <w:pPr>
+        <w:pStyle w:val="ListBullet"/>
+      </w:pPr>
+      <w:r>
+        <w:t>O remetente foi bloqueado</w:t>
+      </w:r>
+    </w:p>
+    <w:p>
+      <w:pPr>
+        <w:pStyle w:val="ListBullet"/>
+      </w:pPr>
+      <w:r>
+        <w:t>[SE APLICÁVEL] Sua senha foi resetada</w:t>
+      </w:r>
+    </w:p>
+    <w:p>
+      <w:pPr>
+        <w:pStyle w:val="ListBullet"/>
+      </w:pPr>
+      <w:r>
+        <w:t>[SE APLICÁVEL] Seus tokens de acesso foram revogados</w:t>
+      </w:r>
+    </w:p>
+    <w:p/>
+    <w:p>
+      <w:r>
+        <w:rPr>
+          <w:b/>
+        </w:rPr>
+        <w:t>Orientações:</w:t>
+      </w:r>
+    </w:p>
+    <w:p>
+      <w:pPr>
+        <w:pStyle w:val="ListBullet"/>
+      </w:pPr>
+      <w:r>
+        <w:t>Não clique em links nem abra anexos suspeitos</w:t>
+      </w:r>
+    </w:p>
+    <w:p>
+      <w:pPr>
+        <w:pStyle w:val="ListBullet"/>
+      </w:pPr>
+      <w:r>
+        <w:t>Reporte e-mails suspeitos pelo GLPI (https://sd.techvarejo.com.br)</w:t>
+      </w:r>
+    </w:p>
+    <w:p>
+      <w:pPr>
+        <w:pStyle w:val="ListBullet"/>
+      </w:pPr>
+      <w:r>
+        <w:t>Dúvidas: Service Desk - (11) 3000-1234</w:t>
+      </w:r>
+    </w:p>
+    <w:p/>
+    <w:p>
+      <w:r>
+        <w:t>Atenciosamente,</w:t>
       </w:r>
     </w:p>
     <w:p>
       <w:r>
         <w:rPr>
-          <w:sz w:val="20"/>
+          <w:b/>
         </w:rPr>
-        <w:t>Assunto: Incidente de Seguranca - E-mail Suspeito Reportado</w:t>
-        <w:br/>
-        <w:br/>
-        <w:t>Prezado(a) [NOME],</w:t>
-        <w:br/>
-        <w:br/>
-        <w:t>O e-mail com assunto "[ASSUNTO]" que voce reportou foi analisado pela equipe de Seguranca da Informacao e confirmado como malicioso.</w:t>
-        <w:br/>
-        <w:br/>
-        <w:t>Acoes tomadas:</w:t>
-        <w:br/>
-        <w:t>- O remetente foi bloqueado</w:t>
-        <w:br/>
-        <w:t>- [SE APLICAVEL] Sua senha foi resetada</w:t>
-        <w:br/>
-        <w:t>- [SE APLICAVEL] Seus tokens de acesso foram revogados</w:t>
-        <w:br/>
-        <w:br/>
-        <w:t>Orientacoes:</w:t>
-        <w:br/>
-        <w:t>- Nao clique em links nem abra anexos suspeitos</w:t>
-        <w:br/>
-        <w:t>- Reporte e-mails suspeitos pelo GLPI (https://sd.techvarejo.com.br)</w:t>
-        <w:br/>
-        <w:t>- Duvidas: Service Desk - (11) 3000-1234</w:t>
-        <w:br/>
-        <w:br/>
-        <w:t>Atenciosamente,</w:t>
-        <w:br/>
-        <w:t>Equipe de Seguranca da Informacao</w:t>
+        <w:t>Equipe de Segurança da Informação</w:t>
         <w:br/>
         <w:t>TechVarejo S.A.</w:t>
       </w:r>
     </w:p>
-    <w:p/>
-    <w:p>
-      <w:pPr>
-        <w:jc w:val="center"/>
-      </w:pPr>
-      <w:r>
-        <w:rPr>
-          <w:color w:val="999999"/>
-          <w:sz w:val="16"/>
-        </w:rPr>
-        <w:t>Curso de SOC - Resposta a Incidentes | Aula 5.4 | TechVarejo S.A.</w:t>
-      </w:r>
-    </w:p>
     <w:sectPr>
       <w:pgSz w:w="12240" w:h="15840"/>
-      <w:pgMar w:top="1417" w:right="1417" w:bottom="1417" w:left="1417" w:header="720" w:footer="720" w:gutter="0"/>
+      <w:pgMar w:top="1440" w:right="1800" w:bottom="1440" w:left="1800" w:header="720" w:footer="720" w:gutter="0"/>
       <w:cols w:space="720"/>
       <w:docGrid w:linePitch="360"/>
     </w:sectPr>
@@ -1276,7 +2736,6 @@
     <w:rsid w:val="00FC693F"/>
     <w:rPr>
       <w:rFonts w:ascii="Calibri" w:hAnsi="Calibri"/>
-      <w:color w:val="333333"/>
       <w:sz w:val="22"/>
     </w:rPr>
   </w:style>

</xml_diff>